<commit_message>
Optokoppler - Ergänzung begonnen.
</commit_message>
<xml_diff>
--- a/00_Vorlagen_IPA/Doku_Vorlage.docx
+++ b/00_Vorlagen_IPA/Doku_Vorlage.docx
@@ -38,7 +38,7 @@
               <w:color w:val="4472C4" w:themeColor="accent1"/>
             </w:rPr>
             <w:drawing>
-              <wp:inline distT="0" distB="0" distL="0" distR="0" wp14:anchorId="3425E6F3" wp14:editId="2D19C12F">
+              <wp:inline distT="0" distB="0" distL="0" distR="0" wp14:anchorId="3425E6F3" wp14:editId="6E0E3A27">
                 <wp:extent cx="1417320" cy="750898"/>
                 <wp:effectExtent l="0" t="0" r="0" b="0"/>
                 <wp:docPr id="143" name="Bild 143"/>
@@ -202,7 +202,94 @@
             <mc:AlternateContent>
               <mc:Choice Requires="wps">
                 <w:drawing>
-                  <wp:anchor distT="0" distB="0" distL="114300" distR="114300" simplePos="0" relativeHeight="251673600" behindDoc="0" locked="0" layoutInCell="1" allowOverlap="1" wp14:anchorId="5014F7CC" wp14:editId="4F733123">
+                  <wp:anchor distT="45720" distB="45720" distL="114300" distR="114300" simplePos="0" relativeHeight="251675648" behindDoc="0" locked="0" layoutInCell="1" allowOverlap="1" wp14:anchorId="42DAB859" wp14:editId="31122FBD">
+                    <wp:simplePos x="0" y="0"/>
+                    <wp:positionH relativeFrom="margin">
+                      <wp:align>right</wp:align>
+                    </wp:positionH>
+                    <wp:positionV relativeFrom="page">
+                      <wp:posOffset>4773295</wp:posOffset>
+                    </wp:positionV>
+                    <wp:extent cx="5711825" cy="4227195"/>
+                    <wp:effectExtent l="0" t="0" r="22225" b="20955"/>
+                    <wp:wrapTopAndBottom/>
+                    <wp:docPr id="1" name="Textfeld 2"/>
+                    <wp:cNvGraphicFramePr>
+                      <a:graphicFrameLocks xmlns:a="http://schemas.openxmlformats.org/drawingml/2006/main"/>
+                    </wp:cNvGraphicFramePr>
+                    <a:graphic xmlns:a="http://schemas.openxmlformats.org/drawingml/2006/main">
+                      <a:graphicData uri="http://schemas.microsoft.com/office/word/2010/wordprocessingShape">
+                        <wps:wsp>
+                          <wps:cNvSpPr txBox="1">
+                            <a:spLocks noChangeArrowheads="1"/>
+                          </wps:cNvSpPr>
+                          <wps:spPr bwMode="auto">
+                            <a:xfrm>
+                              <a:off x="0" y="0"/>
+                              <a:ext cx="5711825" cy="4227195"/>
+                            </a:xfrm>
+                            <a:prstGeom prst="rect">
+                              <a:avLst/>
+                            </a:prstGeom>
+                            <a:solidFill>
+                              <a:srgbClr val="FFFFFF"/>
+                            </a:solidFill>
+                            <a:ln w="9525">
+                              <a:solidFill>
+                                <a:srgbClr val="000000"/>
+                              </a:solidFill>
+                              <a:miter lim="800000"/>
+                              <a:headEnd/>
+                              <a:tailEnd/>
+                            </a:ln>
+                          </wps:spPr>
+                          <wps:txbx>
+                            <w:txbxContent>
+                              <w:p/>
+                            </w:txbxContent>
+                          </wps:txbx>
+                          <wps:bodyPr rot="0" vert="horz" wrap="square" lIns="91440" tIns="45720" rIns="91440" bIns="45720" anchor="t" anchorCtr="0">
+                            <a:noAutofit/>
+                          </wps:bodyPr>
+                        </wps:wsp>
+                      </a:graphicData>
+                    </a:graphic>
+                    <wp14:sizeRelH relativeFrom="margin">
+                      <wp14:pctWidth>0</wp14:pctWidth>
+                    </wp14:sizeRelH>
+                    <wp14:sizeRelV relativeFrom="margin">
+                      <wp14:pctHeight>0</wp14:pctHeight>
+                    </wp14:sizeRelV>
+                  </wp:anchor>
+                </w:drawing>
+              </mc:Choice>
+              <mc:Fallback>
+                <w:pict>
+                  <v:shapetype w14:anchorId="42DAB859" id="_x0000_t202" coordsize="21600,21600" o:spt="202" path="m,l,21600r21600,l21600,xe">
+                    <v:stroke joinstyle="miter"/>
+                    <v:path gradientshapeok="t" o:connecttype="rect"/>
+                  </v:shapetype>
+                  <v:shape id="Textfeld 2" o:spid="_x0000_s1026" type="#_x0000_t202" style="position:absolute;left:0;text-align:left;margin-left:398.55pt;margin-top:375.85pt;width:449.75pt;height:332.85pt;z-index:251675648;visibility:visible;mso-wrap-style:square;mso-width-percent:0;mso-height-percent:0;mso-wrap-distance-left:9pt;mso-wrap-distance-top:3.6pt;mso-wrap-distance-right:9pt;mso-wrap-distance-bottom:3.6pt;mso-position-horizontal:right;mso-position-horizontal-relative:margin;mso-position-vertical:absolute;mso-position-vertical-relative:page;mso-width-percent:0;mso-height-percent:0;mso-width-relative:margin;mso-height-relative:margin;v-text-anchor:top" o:gfxdata="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">
+                    <v:textbox>
+                      <w:txbxContent>
+                        <w:p/>
+                      </w:txbxContent>
+                    </v:textbox>
+                    <w10:wrap type="topAndBottom" anchorx="margin" anchory="page"/>
+                  </v:shape>
+                </w:pict>
+              </mc:Fallback>
+            </mc:AlternateContent>
+          </w:r>
+          <w:r>
+            <w:rPr>
+              <w:noProof/>
+              <w:color w:val="4472C4" w:themeColor="accent1"/>
+            </w:rPr>
+            <mc:AlternateContent>
+              <mc:Choice Requires="wps">
+                <w:drawing>
+                  <wp:anchor distT="0" distB="0" distL="114300" distR="114300" simplePos="0" relativeHeight="251673600" behindDoc="0" locked="0" layoutInCell="1" allowOverlap="1" wp14:anchorId="5014F7CC" wp14:editId="4E3D2D85">
                     <wp:simplePos x="0" y="0"/>
                     <wp:positionH relativeFrom="margin">
                       <wp:align>center</wp:align>
@@ -403,11 +490,7 @@
               </mc:Choice>
               <mc:Fallback>
                 <w:pict>
-                  <v:shapetype w14:anchorId="5014F7CC" id="_x0000_t202" coordsize="21600,21600" o:spt="202" path="m,l,21600r21600,l21600,xe">
-                    <v:stroke joinstyle="miter"/>
-                    <v:path gradientshapeok="t" o:connecttype="rect"/>
-                  </v:shapetype>
-                  <v:shape id="Textfeld 142" o:spid="_x0000_s1026" type="#_x0000_t202" style="position:absolute;left:0;text-align:left;margin-left:0;margin-top:0;width:516pt;height:43.9pt;z-index:251673600;visibility:visible;mso-wrap-style:square;mso-width-percent:1000;mso-height-percent:0;mso-top-percent:850;mso-wrap-distance-left:9pt;mso-wrap-distance-top:0;mso-wrap-distance-right:9pt;mso-wrap-distance-bottom:0;mso-position-horizontal:center;mso-position-horizontal-relative:margin;mso-position-vertical-relative:page;mso-width-percent:1000;mso-height-percent:0;mso-top-percent:850;mso-width-relative:margin;mso-height-relative:margin;v-text-anchor:bottom" o:gfxdata="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" filled="f" stroked="f" strokeweight=".5pt">
+                  <v:shape w14:anchorId="5014F7CC" id="Textfeld 142" o:spid="_x0000_s1027" type="#_x0000_t202" style="position:absolute;left:0;text-align:left;margin-left:0;margin-top:0;width:516pt;height:43.9pt;z-index:251673600;visibility:visible;mso-wrap-style:square;mso-width-percent:1000;mso-height-percent:0;mso-top-percent:850;mso-wrap-distance-left:9pt;mso-wrap-distance-top:0;mso-wrap-distance-right:9pt;mso-wrap-distance-bottom:0;mso-position-horizontal:center;mso-position-horizontal-relative:margin;mso-position-vertical-relative:page;mso-width-percent:1000;mso-height-percent:0;mso-top-percent:850;mso-width-relative:margin;mso-height-relative:margin;v-text-anchor:bottom" o:gfxdata="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" filled="f" stroked="f" strokeweight=".5pt">
                     <v:textbox style="mso-fit-shape-to-text:t" inset="0,0,0,0">
                       <w:txbxContent>
                         <w:sdt>
@@ -3588,8 +3671,6 @@
               <w:noProof/>
             </w:rPr>
           </w:pPr>
-          <w:bookmarkStart w:id="0" w:name="_GoBack"/>
-          <w:bookmarkEnd w:id="0"/>
         </w:p>
         <w:p>
           <w:pPr>
@@ -3699,11 +3780,11 @@
           <w:numId w:val="8"/>
         </w:numPr>
       </w:pPr>
-      <w:bookmarkStart w:id="1" w:name="_Toc236062996"/>
+      <w:bookmarkStart w:id="0" w:name="_Toc236062996"/>
       <w:r>
         <w:t>Vorwort</w:t>
       </w:r>
-      <w:bookmarkEnd w:id="1"/>
+      <w:bookmarkEnd w:id="0"/>
     </w:p>
     <w:p>
       <w:pPr>
@@ -3713,11 +3794,11 @@
           <w:numId w:val="1"/>
         </w:numPr>
       </w:pPr>
-      <w:bookmarkStart w:id="2" w:name="_Toc236062997"/>
+      <w:bookmarkStart w:id="1" w:name="_Toc236062997"/>
       <w:r>
         <w:t>Einleitung</w:t>
       </w:r>
-      <w:bookmarkEnd w:id="2"/>
+      <w:bookmarkEnd w:id="1"/>
     </w:p>
     <w:p/>
     <w:p/>
@@ -3804,7 +3885,7 @@
               </wp:anchor>
             </w:drawing>
           </mc:Choice>
-          <mc:Fallback xmlns:oel="http://schemas.microsoft.com/office/2019/extlst" xmlns:w16cex="http://schemas.microsoft.com/office/word/2018/wordml/cex" xmlns:w16="http://schemas.microsoft.com/office/word/2018/wordml" xmlns:w16du="http://schemas.microsoft.com/office/word/2023/wordml/word16du" xmlns:w16sdtdh="http://schemas.microsoft.com/office/word/2020/wordml/sdtdatahash" xmlns:w16sdtfl="http://schemas.microsoft.com/office/word/2024/wordml/sdtformatlock">
+          <mc:Fallback xmlns:w16sdtfl="http://schemas.microsoft.com/office/word/2024/wordml/sdtformatlock" xmlns:w16sdtdh="http://schemas.microsoft.com/office/word/2020/wordml/sdtdatahash" xmlns:w16du="http://schemas.microsoft.com/office/word/2023/wordml/word16du" xmlns:w16="http://schemas.microsoft.com/office/word/2018/wordml" xmlns:w16cex="http://schemas.microsoft.com/office/word/2018/wordml/cex" xmlns:oel="http://schemas.microsoft.com/office/2019/extlst">
             <w:pict>
               <v:shapetype w14:anchorId="21D0CD98" id="_x0000_t66" coordsize="21600,21600" o:spt="66" adj="5400,5400" path="m@0,l@0@1,21600@1,21600@2@0@2@0,21600,,10800xe">
                 <v:stroke joinstyle="miter"/>
@@ -3974,7 +4055,7 @@
           <w:numId w:val="8"/>
         </w:numPr>
       </w:pPr>
-      <w:bookmarkStart w:id="3" w:name="_Toc236062998"/>
+      <w:bookmarkStart w:id="2" w:name="_Toc236062998"/>
       <w:r>
         <w:rPr>
           <w:noProof/>
@@ -4082,7 +4163,7 @@
           </mc:Choice>
           <mc:Fallback>
             <w:pict>
-              <v:shape w14:anchorId="37400B99" id="Textfeld 2" o:spid="_x0000_s1027" type="#_x0000_t202" style="position:absolute;left:0;text-align:left;margin-left:238.5pt;margin-top:96pt;width:180.5pt;height:120pt;z-index:251665408;visibility:visible;mso-wrap-style:square;mso-width-percent:400;mso-height-percent:0;mso-wrap-distance-left:9pt;mso-wrap-distance-top:3.6pt;mso-wrap-distance-right:9pt;mso-wrap-distance-bottom:3.6pt;mso-position-horizontal:absolute;mso-position-horizontal-relative:margin;mso-position-vertical:absolute;mso-position-vertical-relative:page;mso-width-percent:400;mso-height-percent:0;mso-width-relative:margin;mso-height-relative:margin;v-text-anchor:top" o:gfxdata="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" stroked="f">
+              <v:shape w14:anchorId="37400B99" id="_x0000_s1028" type="#_x0000_t202" style="position:absolute;left:0;text-align:left;margin-left:238.5pt;margin-top:96pt;width:180.5pt;height:120pt;z-index:251665408;visibility:visible;mso-wrap-style:square;mso-width-percent:400;mso-height-percent:0;mso-wrap-distance-left:9pt;mso-wrap-distance-top:3.6pt;mso-wrap-distance-right:9pt;mso-wrap-distance-bottom:3.6pt;mso-position-horizontal:absolute;mso-position-horizontal-relative:margin;mso-position-vertical:absolute;mso-position-vertical-relative:page;mso-width-percent:400;mso-height-percent:0;mso-width-relative:margin;mso-height-relative:margin;v-text-anchor:top" o:gfxdata="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" stroked="f">
                 <v:textbox>
                   <w:txbxContent>
                     <w:p>
@@ -4296,7 +4377,7 @@
           </mc:Choice>
           <mc:Fallback>
             <w:pict>
-              <v:shape w14:anchorId="26BF927A" id="_x0000_s1028" type="#_x0000_t202" style="position:absolute;left:0;text-align:left;margin-left:0;margin-top:217.5pt;width:180.5pt;height:186.75pt;z-index:251667456;visibility:visible;mso-wrap-style:square;mso-width-percent:400;mso-height-percent:0;mso-wrap-distance-left:9pt;mso-wrap-distance-top:3.6pt;mso-wrap-distance-right:9pt;mso-wrap-distance-bottom:3.6pt;mso-position-horizontal:left;mso-position-horizontal-relative:margin;mso-position-vertical:absolute;mso-position-vertical-relative:page;mso-width-percent:400;mso-height-percent:0;mso-width-relative:margin;mso-height-relative:margin;v-text-anchor:top" o:gfxdata="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" stroked="f">
+              <v:shape w14:anchorId="26BF927A" id="_x0000_s1029" type="#_x0000_t202" style="position:absolute;left:0;text-align:left;margin-left:0;margin-top:217.5pt;width:180.5pt;height:186.75pt;z-index:251667456;visibility:visible;mso-wrap-style:square;mso-width-percent:400;mso-height-percent:0;mso-wrap-distance-left:9pt;mso-wrap-distance-top:3.6pt;mso-wrap-distance-right:9pt;mso-wrap-distance-bottom:3.6pt;mso-position-horizontal:left;mso-position-horizontal-relative:margin;mso-position-vertical:absolute;mso-position-vertical-relative:page;mso-width-percent:400;mso-height-percent:0;mso-width-relative:margin;mso-height-relative:margin;v-text-anchor:top" o:gfxdata="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" stroked="f">
                 <v:textbox>
                   <w:txbxContent>
                     <w:p>
@@ -4529,7 +4610,7 @@
           </mc:Choice>
           <mc:Fallback>
             <w:pict>
-              <v:shape w14:anchorId="558EB152" id="_x0000_s1029" type="#_x0000_t202" style="position:absolute;left:0;text-align:left;margin-left:0;margin-top:95.9pt;width:180.5pt;height:117pt;z-index:251663360;visibility:visible;mso-wrap-style:square;mso-width-percent:400;mso-height-percent:0;mso-wrap-distance-left:9pt;mso-wrap-distance-top:3.6pt;mso-wrap-distance-right:9pt;mso-wrap-distance-bottom:3.6pt;mso-position-horizontal:left;mso-position-horizontal-relative:margin;mso-position-vertical:absolute;mso-position-vertical-relative:page;mso-width-percent:400;mso-height-percent:0;mso-width-relative:margin;mso-height-relative:margin;v-text-anchor:top" o:gfxdata="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" stroked="f">
+              <v:shape w14:anchorId="558EB152" id="_x0000_s1030" type="#_x0000_t202" style="position:absolute;left:0;text-align:left;margin-left:0;margin-top:95.9pt;width:180.5pt;height:117pt;z-index:251663360;visibility:visible;mso-wrap-style:square;mso-width-percent:400;mso-height-percent:0;mso-wrap-distance-left:9pt;mso-wrap-distance-top:3.6pt;mso-wrap-distance-right:9pt;mso-wrap-distance-bottom:3.6pt;mso-position-horizontal:left;mso-position-horizontal-relative:margin;mso-position-vertical:absolute;mso-position-vertical-relative:page;mso-width-percent:400;mso-height-percent:0;mso-width-relative:margin;mso-height-relative:margin;v-text-anchor:top" o:gfxdata="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" stroked="f">
                 <v:textbox>
                   <w:txbxContent>
                     <w:p>
@@ -4704,7 +4785,7 @@
           </mc:Choice>
           <mc:Fallback>
             <w:pict>
-              <v:shape w14:anchorId="33C443AC" id="_x0000_s1030" type="#_x0000_t202" style="position:absolute;left:0;text-align:left;margin-left:237.75pt;margin-top:217.5pt;width:180.5pt;height:95.75pt;z-index:251669504;visibility:visible;mso-wrap-style:square;mso-width-percent:400;mso-height-percent:0;mso-wrap-distance-left:9pt;mso-wrap-distance-top:3.6pt;mso-wrap-distance-right:9pt;mso-wrap-distance-bottom:3.6pt;mso-position-horizontal:absolute;mso-position-horizontal-relative:margin;mso-position-vertical:absolute;mso-position-vertical-relative:page;mso-width-percent:400;mso-height-percent:0;mso-width-relative:margin;mso-height-relative:margin;v-text-anchor:top" o:gfxdata="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" stroked="f">
+              <v:shape w14:anchorId="33C443AC" id="_x0000_s1031" type="#_x0000_t202" style="position:absolute;left:0;text-align:left;margin-left:237.75pt;margin-top:217.5pt;width:180.5pt;height:95.75pt;z-index:251669504;visibility:visible;mso-wrap-style:square;mso-width-percent:400;mso-height-percent:0;mso-wrap-distance-left:9pt;mso-wrap-distance-top:3.6pt;mso-wrap-distance-right:9pt;mso-wrap-distance-bottom:3.6pt;mso-position-horizontal:absolute;mso-position-horizontal-relative:margin;mso-position-vertical:absolute;mso-position-vertical-relative:page;mso-width-percent:400;mso-height-percent:0;mso-width-relative:margin;mso-height-relative:margin;v-text-anchor:top" o:gfxdata="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" stroked="f">
                 <v:textbox>
                   <w:txbxContent>
                     <w:p>
@@ -4888,7 +4969,7 @@
           </mc:Choice>
           <mc:Fallback>
             <w:pict>
-              <v:shape w14:anchorId="297AED27" id="_x0000_s1031" type="#_x0000_t202" style="position:absolute;left:0;text-align:left;margin-left:0;margin-top:411.8pt;width:180.5pt;height:201.05pt;z-index:251671552;visibility:visible;mso-wrap-style:square;mso-width-percent:400;mso-height-percent:0;mso-wrap-distance-left:9pt;mso-wrap-distance-top:3.6pt;mso-wrap-distance-right:9pt;mso-wrap-distance-bottom:3.6pt;mso-position-horizontal:left;mso-position-horizontal-relative:margin;mso-position-vertical:absolute;mso-position-vertical-relative:page;mso-width-percent:400;mso-height-percent:0;mso-width-relative:margin;mso-height-relative:margin;v-text-anchor:top" o:gfxdata="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" stroked="f">
+              <v:shape w14:anchorId="297AED27" id="_x0000_s1032" type="#_x0000_t202" style="position:absolute;left:0;text-align:left;margin-left:0;margin-top:411.8pt;width:180.5pt;height:201.05pt;z-index:251671552;visibility:visible;mso-wrap-style:square;mso-width-percent:400;mso-height-percent:0;mso-wrap-distance-left:9pt;mso-wrap-distance-top:3.6pt;mso-wrap-distance-right:9pt;mso-wrap-distance-bottom:3.6pt;mso-position-horizontal:left;mso-position-horizontal-relative:margin;mso-position-vertical:absolute;mso-position-vertical-relative:page;mso-width-percent:400;mso-height-percent:0;mso-width-relative:margin;mso-height-relative:margin;v-text-anchor:top" o:gfxdata="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" stroked="f">
                 <v:textbox>
                   <w:txbxContent>
                     <w:p>
@@ -4969,7 +5050,7 @@
       <w:r>
         <w:t>Beteiligte Personen</w:t>
       </w:r>
-      <w:bookmarkEnd w:id="3"/>
+      <w:bookmarkEnd w:id="2"/>
     </w:p>
     <w:p>
       <w:r>
@@ -4984,12 +5065,12 @@
           <w:numId w:val="8"/>
         </w:numPr>
       </w:pPr>
-      <w:bookmarkStart w:id="4" w:name="_Toc236062999"/>
+      <w:bookmarkStart w:id="3" w:name="_Toc236062999"/>
       <w:r>
         <w:lastRenderedPageBreak/>
         <w:t>Auftrag</w:t>
       </w:r>
-      <w:bookmarkEnd w:id="4"/>
+      <w:bookmarkEnd w:id="3"/>
     </w:p>
     <w:p>
       <w:pPr>
@@ -4999,11 +5080,11 @@
           <w:numId w:val="1"/>
         </w:numPr>
       </w:pPr>
-      <w:bookmarkStart w:id="5" w:name="_Toc236063000"/>
+      <w:bookmarkStart w:id="4" w:name="_Toc236063000"/>
       <w:r>
         <w:t>Vorgaben</w:t>
       </w:r>
-      <w:bookmarkEnd w:id="5"/>
+      <w:bookmarkEnd w:id="4"/>
     </w:p>
     <w:p>
       <w:pPr>
@@ -5013,11 +5094,11 @@
           <w:numId w:val="1"/>
         </w:numPr>
       </w:pPr>
-      <w:bookmarkStart w:id="6" w:name="_Toc236063001"/>
+      <w:bookmarkStart w:id="5" w:name="_Toc236063001"/>
       <w:r>
         <w:t>Überlegungen</w:t>
       </w:r>
-      <w:bookmarkEnd w:id="6"/>
+      <w:bookmarkEnd w:id="5"/>
     </w:p>
     <w:p>
       <w:pPr>
@@ -5027,11 +5108,11 @@
           <w:numId w:val="1"/>
         </w:numPr>
       </w:pPr>
-      <w:bookmarkStart w:id="7" w:name="_Toc236063002"/>
+      <w:bookmarkStart w:id="6" w:name="_Toc236063002"/>
       <w:r>
         <w:t>Zeitplanung</w:t>
       </w:r>
-      <w:bookmarkEnd w:id="7"/>
+      <w:bookmarkEnd w:id="6"/>
     </w:p>
     <w:p>
       <w:pPr>
@@ -5041,11 +5122,11 @@
           <w:numId w:val="1"/>
         </w:numPr>
       </w:pPr>
-      <w:bookmarkStart w:id="8" w:name="_Toc236063003"/>
+      <w:bookmarkStart w:id="7" w:name="_Toc236063003"/>
       <w:r>
         <w:t>Kosten</w:t>
       </w:r>
-      <w:bookmarkEnd w:id="8"/>
+      <w:bookmarkEnd w:id="7"/>
     </w:p>
     <w:p>
       <w:pPr>
@@ -5055,11 +5136,11 @@
           <w:numId w:val="8"/>
         </w:numPr>
       </w:pPr>
-      <w:bookmarkStart w:id="9" w:name="_Toc236063004"/>
+      <w:bookmarkStart w:id="8" w:name="_Toc236063004"/>
       <w:r>
         <w:t>Schema</w:t>
       </w:r>
-      <w:bookmarkEnd w:id="9"/>
+      <w:bookmarkEnd w:id="8"/>
     </w:p>
     <w:p>
       <w:pPr>
@@ -5069,11 +5150,11 @@
           <w:numId w:val="8"/>
         </w:numPr>
       </w:pPr>
-      <w:bookmarkStart w:id="10" w:name="_Toc236063005"/>
+      <w:bookmarkStart w:id="9" w:name="_Toc236063005"/>
       <w:r>
         <w:t>Überblick</w:t>
       </w:r>
-      <w:bookmarkEnd w:id="10"/>
+      <w:bookmarkEnd w:id="9"/>
     </w:p>
     <w:p>
       <w:pPr>
@@ -5083,11 +5164,11 @@
           <w:numId w:val="8"/>
         </w:numPr>
       </w:pPr>
-      <w:bookmarkStart w:id="11" w:name="_Toc236063006"/>
+      <w:bookmarkStart w:id="10" w:name="_Toc236063006"/>
       <w:r>
         <w:t>Microcontroller</w:t>
       </w:r>
-      <w:bookmarkEnd w:id="11"/>
+      <w:bookmarkEnd w:id="10"/>
     </w:p>
     <w:p>
       <w:pPr>
@@ -5097,11 +5178,11 @@
           <w:numId w:val="8"/>
         </w:numPr>
       </w:pPr>
-      <w:bookmarkStart w:id="12" w:name="_Toc236063007"/>
+      <w:bookmarkStart w:id="11" w:name="_Toc236063007"/>
       <w:r>
         <w:t>Layout</w:t>
       </w:r>
-      <w:bookmarkEnd w:id="12"/>
+      <w:bookmarkEnd w:id="11"/>
     </w:p>
     <w:p>
       <w:pPr>
@@ -5111,11 +5192,11 @@
           <w:numId w:val="8"/>
         </w:numPr>
       </w:pPr>
-      <w:bookmarkStart w:id="13" w:name="_Toc236063008"/>
+      <w:bookmarkStart w:id="12" w:name="_Toc236063008"/>
       <w:r>
         <w:t>Bestückung</w:t>
       </w:r>
-      <w:bookmarkEnd w:id="13"/>
+      <w:bookmarkEnd w:id="12"/>
     </w:p>
     <w:p>
       <w:pPr>
@@ -5125,11 +5206,11 @@
           <w:numId w:val="8"/>
         </w:numPr>
       </w:pPr>
-      <w:bookmarkStart w:id="14" w:name="_Toc236063009"/>
+      <w:bookmarkStart w:id="13" w:name="_Toc236063009"/>
       <w:r>
         <w:t>Inbetriebnahme</w:t>
       </w:r>
-      <w:bookmarkEnd w:id="14"/>
+      <w:bookmarkEnd w:id="13"/>
     </w:p>
     <w:p>
       <w:pPr>
@@ -5139,11 +5220,11 @@
           <w:numId w:val="8"/>
         </w:numPr>
       </w:pPr>
-      <w:bookmarkStart w:id="15" w:name="_Toc236063010"/>
+      <w:bookmarkStart w:id="14" w:name="_Toc236063010"/>
       <w:r>
         <w:t>Programmierung</w:t>
       </w:r>
-      <w:bookmarkEnd w:id="15"/>
+      <w:bookmarkEnd w:id="14"/>
     </w:p>
     <w:p>
       <w:pPr>
@@ -5153,11 +5234,11 @@
           <w:numId w:val="8"/>
         </w:numPr>
       </w:pPr>
-      <w:bookmarkStart w:id="16" w:name="_Toc236063011"/>
+      <w:bookmarkStart w:id="15" w:name="_Toc236063011"/>
       <w:r>
         <w:t>Ablauf</w:t>
       </w:r>
-      <w:bookmarkEnd w:id="16"/>
+      <w:bookmarkEnd w:id="15"/>
     </w:p>
     <w:p>
       <w:pPr>
@@ -5167,11 +5248,11 @@
           <w:numId w:val="8"/>
         </w:numPr>
       </w:pPr>
-      <w:bookmarkStart w:id="17" w:name="_Toc236063012"/>
+      <w:bookmarkStart w:id="16" w:name="_Toc236063012"/>
       <w:r>
         <w:t>Umsetzung</w:t>
       </w:r>
-      <w:bookmarkEnd w:id="17"/>
+      <w:bookmarkEnd w:id="16"/>
     </w:p>
     <w:p>
       <w:pPr>
@@ -5181,11 +5262,11 @@
           <w:numId w:val="8"/>
         </w:numPr>
       </w:pPr>
-      <w:bookmarkStart w:id="18" w:name="_Toc236063013"/>
+      <w:bookmarkStart w:id="17" w:name="_Toc236063013"/>
       <w:r>
         <w:t>Funktionen</w:t>
       </w:r>
-      <w:bookmarkEnd w:id="18"/>
+      <w:bookmarkEnd w:id="17"/>
     </w:p>
     <w:p>
       <w:pPr>
@@ -5195,11 +5276,11 @@
           <w:numId w:val="8"/>
         </w:numPr>
       </w:pPr>
-      <w:bookmarkStart w:id="19" w:name="_Toc236063014"/>
+      <w:bookmarkStart w:id="18" w:name="_Toc236063014"/>
       <w:r>
         <w:t>Funktionskontrolle Software</w:t>
       </w:r>
-      <w:bookmarkEnd w:id="19"/>
+      <w:bookmarkEnd w:id="18"/>
     </w:p>
     <w:p>
       <w:pPr>
@@ -5209,11 +5290,11 @@
           <w:numId w:val="8"/>
         </w:numPr>
       </w:pPr>
-      <w:bookmarkStart w:id="20" w:name="_Toc236063015"/>
+      <w:bookmarkStart w:id="19" w:name="_Toc236063015"/>
       <w:r>
         <w:t>Probleme/ Lösungen</w:t>
       </w:r>
-      <w:bookmarkEnd w:id="20"/>
+      <w:bookmarkEnd w:id="19"/>
     </w:p>
     <w:p>
       <w:pPr>
@@ -5223,11 +5304,11 @@
           <w:numId w:val="8"/>
         </w:numPr>
       </w:pPr>
-      <w:bookmarkStart w:id="21" w:name="_Toc236063016"/>
+      <w:bookmarkStart w:id="20" w:name="_Toc236063016"/>
       <w:r>
         <w:t>Infrastruktur</w:t>
       </w:r>
-      <w:bookmarkEnd w:id="21"/>
+      <w:bookmarkEnd w:id="20"/>
     </w:p>
     <w:p>
       <w:pPr>
@@ -5237,11 +5318,11 @@
           <w:numId w:val="8"/>
         </w:numPr>
       </w:pPr>
-      <w:bookmarkStart w:id="22" w:name="_Toc236063017"/>
+      <w:bookmarkStart w:id="21" w:name="_Toc236063017"/>
       <w:r>
         <w:t>Arbeitsplatz</w:t>
       </w:r>
-      <w:bookmarkEnd w:id="22"/>
+      <w:bookmarkEnd w:id="21"/>
     </w:p>
     <w:p>
       <w:pPr>
@@ -5251,11 +5332,11 @@
           <w:numId w:val="8"/>
         </w:numPr>
       </w:pPr>
-      <w:bookmarkStart w:id="23" w:name="_Toc236063018"/>
+      <w:bookmarkStart w:id="22" w:name="_Toc236063018"/>
       <w:r>
         <w:t>Software</w:t>
       </w:r>
-      <w:bookmarkEnd w:id="23"/>
+      <w:bookmarkEnd w:id="22"/>
     </w:p>
     <w:p>
       <w:pPr>
@@ -5265,11 +5346,11 @@
           <w:numId w:val="8"/>
         </w:numPr>
       </w:pPr>
-      <w:bookmarkStart w:id="24" w:name="_Toc236063019"/>
+      <w:bookmarkStart w:id="23" w:name="_Toc236063019"/>
       <w:r>
         <w:t>Ziele</w:t>
       </w:r>
-      <w:bookmarkEnd w:id="24"/>
+      <w:bookmarkEnd w:id="23"/>
     </w:p>
     <w:p>
       <w:pPr>
@@ -5279,11 +5360,11 @@
           <w:numId w:val="8"/>
         </w:numPr>
       </w:pPr>
-      <w:bookmarkStart w:id="25" w:name="_Toc236063020"/>
+      <w:bookmarkStart w:id="24" w:name="_Toc236063020"/>
       <w:r>
         <w:t>Zielerreichung</w:t>
       </w:r>
-      <w:bookmarkEnd w:id="25"/>
+      <w:bookmarkEnd w:id="24"/>
     </w:p>
     <w:p>
       <w:pPr>
@@ -5293,11 +5374,11 @@
           <w:numId w:val="8"/>
         </w:numPr>
       </w:pPr>
-      <w:bookmarkStart w:id="26" w:name="_Toc236063021"/>
+      <w:bookmarkStart w:id="25" w:name="_Toc236063021"/>
       <w:r>
         <w:t>Allfällige Erweiterungen</w:t>
       </w:r>
-      <w:bookmarkEnd w:id="26"/>
+      <w:bookmarkEnd w:id="25"/>
     </w:p>
     <w:p>
       <w:pPr>
@@ -5307,11 +5388,11 @@
           <w:numId w:val="8"/>
         </w:numPr>
       </w:pPr>
-      <w:bookmarkStart w:id="27" w:name="_Toc236063022"/>
+      <w:bookmarkStart w:id="26" w:name="_Toc236063022"/>
       <w:r>
         <w:t>Fazit</w:t>
       </w:r>
-      <w:bookmarkEnd w:id="27"/>
+      <w:bookmarkEnd w:id="26"/>
     </w:p>
     <w:p>
       <w:pPr>
@@ -5321,11 +5402,42 @@
           <w:numId w:val="8"/>
         </w:numPr>
       </w:pPr>
-      <w:bookmarkStart w:id="28" w:name="_Toc236063023"/>
+      <w:bookmarkStart w:id="27" w:name="_Toc236063023"/>
       <w:r>
         <w:t>Quellen</w:t>
       </w:r>
+      <w:bookmarkEnd w:id="27"/>
+    </w:p>
+    <w:p>
+      <w:pPr>
+        <w:pStyle w:val="berschrift2"/>
+        <w:numPr>
+          <w:ilvl w:val="1"/>
+          <w:numId w:val="8"/>
+        </w:numPr>
+      </w:pPr>
+      <w:r>
+        <w:t>Abbildungsverzeichnis</w:t>
+      </w:r>
+    </w:p>
+    <w:p>
+      <w:pPr>
+        <w:pStyle w:val="berschrift2"/>
+        <w:numPr>
+          <w:ilvl w:val="1"/>
+          <w:numId w:val="8"/>
+        </w:numPr>
+      </w:pPr>
+      <w:r>
+        <w:t>Sonstige</w:t>
+      </w:r>
+      <w:bookmarkStart w:id="28" w:name="_GoBack"/>
       <w:bookmarkEnd w:id="28"/>
+    </w:p>
+    <w:p>
+      <w:r>
+        <w:br w:type="page"/>
+      </w:r>
     </w:p>
     <w:p>
       <w:pPr>
@@ -5337,6 +5449,7 @@
       </w:pPr>
       <w:bookmarkStart w:id="29" w:name="_Toc236063024"/>
       <w:r>
+        <w:lastRenderedPageBreak/>
         <w:t>Anhang</w:t>
       </w:r>
       <w:bookmarkEnd w:id="29"/>
@@ -7702,6 +7815,7 @@
     <w:rsid w:val="00D35ACC"/>
     <w:rsid w:val="00D41DE2"/>
     <w:rsid w:val="00DA2155"/>
+    <w:rsid w:val="00F77FF5"/>
   </w:rsids>
   <m:mathPr>
     <m:mathFont m:val="Cambria Math"/>
@@ -8520,7 +8634,7 @@
 </file>
 
 <file path=customXml/itemProps2.xml><?xml version="1.0" encoding="utf-8"?>
-<ds:datastoreItem xmlns:ds="http://schemas.openxmlformats.org/officeDocument/2006/customXml" ds:itemID="{951AA3DC-9E50-46F6-BF8A-70F890BD9653}">
+<ds:datastoreItem xmlns:ds="http://schemas.openxmlformats.org/officeDocument/2006/customXml" ds:itemID="{A03F6394-4A2E-4840-AE4F-0380644744A5}">
   <ds:schemaRefs>
     <ds:schemaRef ds:uri="http://schemas.openxmlformats.org/officeDocument/2006/bibliography"/>
   </ds:schemaRefs>

</xml_diff>